<commit_message>
Adiciona simulador de rede de filas do M6 (extensão do M4 para tandem)
- simulador_rede_filas.py: generaliza o motor de eventos do M4 (fila
  única) para uma rede de filas G/G/c/K com topologia genérica e
  roteamento probabilístico entre filas (inclusive ciclos); reaproveita
  o mesmo gerador MCL, e reproduz o M4 draw-a-draw quando rodado com
  uma única fila sem roteamento
- LEIA-ME.md: instruções de uso do simulador para quem não acompanhou
  o desenvolvimento
- Preenche o M6 - Desenvolvimento de Simulador para Filas em Tandem.docx
  com o link do repositório e os resultados da rede de validação pedida
  (Fila 1 G/G/2/3 em tandem com a Fila 2 G/G/1/5)
- CLAUDE.md/README.md: documenta a arquitetura e adiciona o M6 à lista
  de módulos
</commit_message>
<xml_diff>
--- a/M6 - Desenvolvimento de Simulador para Filas em Tandem/M6 - Desenvolvimento de Simulador para Filas em Tandem.docx
+++ b/M6 - Desenvolvimento de Simulador para Filas em Tandem/M6 - Desenvolvimento de Simulador para Filas em Tandem.docx
@@ -51,52 +51,13 @@
           <w:color w:val="000000"/>
           <w:shd w:val="clear" w:color="auto" w:fill="FFFFFF"/>
         </w:rPr>
-        <w:t> </w:t>
-      </w:r>
-      <w:r>
-        <w:rPr>
-          <w:rStyle w:val="normaltextrun"/>
-          <w:rFonts w:ascii="Calibri" w:hAnsi="Calibri" w:cs="Calibri"/>
-          <w:color w:val="000000"/>
-          <w:shd w:val="clear" w:color="auto" w:fill="FFFFFF"/>
-        </w:rPr>
-        <w:t>UA</w:t>
-      </w:r>
-      <w:r>
-        <w:rPr>
-          <w:rStyle w:val="normaltextrun"/>
-          <w:rFonts w:ascii="Calibri" w:hAnsi="Calibri" w:cs="Calibri"/>
-          <w:color w:val="000000"/>
-          <w:shd w:val="clear" w:color="auto" w:fill="FFFFFF"/>
-        </w:rPr>
-        <w:t>2</w:t>
-      </w:r>
-      <w:r>
-        <w:rPr>
-          <w:rStyle w:val="normaltextrun"/>
-          <w:rFonts w:ascii="Calibri" w:hAnsi="Calibri" w:cs="Calibri"/>
-          <w:color w:val="000000"/>
-          <w:shd w:val="clear" w:color="auto" w:fill="FFFFFF"/>
-        </w:rPr>
-        <w:t xml:space="preserve"> | </w:t>
+        <w:t xml:space="preserve"> UA2 | </w:t>
       </w:r>
       <w:r>
         <w:rPr>
           <w:bCs/>
         </w:rPr>
-        <w:t>F</w:t>
-      </w:r>
-      <w:r>
-        <w:rPr>
-          <w:bCs/>
-        </w:rPr>
-        <w:t>U</w:t>
-      </w:r>
-      <w:r>
-        <w:rPr>
-          <w:bCs/>
-        </w:rPr>
-        <w:t>NDAMENTOS DE SIMULAÇÃO POR COMPUTADOR</w:t>
+        <w:t>FUNDAMENTOS DE SIMULAÇÃO POR COMPUTADOR</w:t>
       </w:r>
     </w:p>
     <w:p>
@@ -117,37 +78,7 @@
         <w:rPr>
           <w:bCs/>
         </w:rPr>
-        <w:t xml:space="preserve"> </w:t>
-      </w:r>
-      <w:r>
-        <w:rPr>
-          <w:bCs/>
-        </w:rPr>
-        <w:t>M</w:t>
-      </w:r>
-      <w:r>
-        <w:rPr>
-          <w:bCs/>
-        </w:rPr>
-        <w:t>6</w:t>
-      </w:r>
-      <w:r>
-        <w:rPr>
-          <w:bCs/>
-        </w:rPr>
-        <w:t xml:space="preserve"> </w:t>
-      </w:r>
-      <w:r>
-        <w:rPr>
-          <w:bCs/>
-        </w:rPr>
-        <w:t xml:space="preserve">| </w:t>
-      </w:r>
-      <w:r>
-        <w:rPr>
-          <w:bCs/>
-        </w:rPr>
-        <w:t>SIMULAÇÃO DE FILAS EM TANDEM</w:t>
+        <w:t xml:space="preserve"> M6 | SIMULAÇÃO DE FILAS EM TANDEM</w:t>
       </w:r>
     </w:p>
     <w:p>
@@ -162,6 +93,9 @@
           <w:b/>
         </w:rPr>
         <w:t xml:space="preserve">Estudantes: </w:t>
+      </w:r>
+      <w:r>
+        <w:t>Guilherme Guimarães Santos e Jully Anne Seyffert da Silva Jara</w:t>
       </w:r>
     </w:p>
     <w:p>
@@ -257,42 +191,7 @@
           <w:b/>
           <w:bCs/>
         </w:rPr>
-        <w:t>Entrega</w:t>
-      </w:r>
-      <w:r>
-        <w:rPr>
-          <w:b/>
-          <w:bCs/>
-        </w:rPr>
-        <w:t xml:space="preserve"> | </w:t>
-      </w:r>
-      <w:r>
-        <w:rPr>
-          <w:b/>
-          <w:bCs/>
-        </w:rPr>
-        <w:t>Fila</w:t>
-      </w:r>
-      <w:r>
-        <w:rPr>
-          <w:b/>
-          <w:bCs/>
-        </w:rPr>
-        <w:t>s</w:t>
-      </w:r>
-      <w:r>
-        <w:rPr>
-          <w:b/>
-          <w:bCs/>
-        </w:rPr>
-        <w:t xml:space="preserve"> </w:t>
-      </w:r>
-      <w:r>
-        <w:rPr>
-          <w:b/>
-          <w:bCs/>
-        </w:rPr>
-        <w:t>em Tandem</w:t>
+        <w:t xml:space="preserve">Entrega | Filas em Tandem</w:t>
       </w:r>
     </w:p>
     <w:p>
@@ -349,13 +248,7 @@
               </w:numPr>
             </w:pPr>
             <w:r>
-              <w:t>Link para o c</w:t>
-            </w:r>
-            <w:r>
-              <w:t>ódigo fonte do grupo</w:t>
-            </w:r>
-            <w:r>
-              <w:t>:</w:t>
+              <w:t>Link para o código fonte do grupo:</w:t>
             </w:r>
           </w:p>
           <w:p/>
@@ -370,13 +263,11 @@
             <w:tcW w:w="9629" w:type="dxa"/>
             <w:shd w:val="clear" w:color="auto" w:fill="FFFFFF" w:themeFill="background1"/>
           </w:tcPr>
-          <w:p/>
-          <w:p/>
-          <w:p/>
-          <w:p/>
-          <w:p/>
-          <w:p/>
-          <w:p/>
+          <w:p>
+            <w:r>
+              <w:t xml:space="preserve">https://github.com/Quidoguim/SMA</w:t>
+            </w:r>
+          </w:p>
         </w:tc>
       </w:tr>
       <w:tr>
@@ -413,23 +304,7 @@
                 <w:b/>
                 <w:bCs/>
               </w:rPr>
-              <w:t xml:space="preserve"> </w:t>
-            </w:r>
-            <w:proofErr w:type="gramStart"/>
-            <w:r>
-              <w:rPr>
-                <w:b/>
-                <w:bCs/>
-              </w:rPr>
-              <w:t>1..</w:t>
-            </w:r>
-            <w:proofErr w:type="gramEnd"/>
-            <w:r>
-              <w:rPr>
-                <w:b/>
-                <w:bCs/>
-              </w:rPr>
-              <w:t>5</w:t>
+              <w:t xml:space="preserve"> 1..5</w:t>
             </w:r>
             <w:r>
               <w:t>, atendimento</w:t>
@@ -449,30 +324,7 @@
                 <w:b/>
                 <w:bCs/>
               </w:rPr>
-              <w:t xml:space="preserve"> </w:t>
-            </w:r>
-            <w:proofErr w:type="gramStart"/>
-            <w:r>
-              <w:rPr>
-                <w:b/>
-                <w:bCs/>
-              </w:rPr>
-              <w:t>4</w:t>
-            </w:r>
-            <w:r>
-              <w:rPr>
-                <w:b/>
-                <w:bCs/>
-              </w:rPr>
-              <w:t>..</w:t>
-            </w:r>
-            <w:proofErr w:type="gramEnd"/>
-            <w:r>
-              <w:rPr>
-                <w:b/>
-                <w:bCs/>
-              </w:rPr>
-              <w:t>5</w:t>
+              <w:t xml:space="preserve"> 4..5</w:t>
             </w:r>
             <w:r>
               <w:t>:</w:t>
@@ -487,12 +339,73 @@
             <w:tcW w:w="9629" w:type="dxa"/>
             <w:shd w:val="clear" w:color="auto" w:fill="FFFFFF" w:themeFill="background1"/>
           </w:tcPr>
-          <w:p/>
-          <w:p/>
-          <w:p/>
-          <w:p/>
-          <w:p/>
-          <w:p/>
+          <w:p>
+            <w:r>
+              <w:rPr>
+                <w:b/>
+                <w:bCs/>
+              </w:rPr>
+              <w:t xml:space="preserve">Resultados da simulação — Fila 1 (G/G/2/3), rede em tandem com a Fila 2</w:t>
+            </w:r>
+          </w:p>
+          <w:p>
+            <w:r>
+              <w:t xml:space="preserve">Números pseudoaleatórios utilizados na simulação da rede: 100.000</w:t>
+            </w:r>
+          </w:p>
+          <w:p>
+            <w:r>
+              <w:t xml:space="preserve">Tempo global da simulação (rede completa): 100.650,77</w:t>
+            </w:r>
+          </w:p>
+          <w:p>
+            <w:r>
+              <w:t xml:space="preserve">Clientes perdidos (bloqueados) na Fila 1: 395</w:t>
+            </w:r>
+          </w:p>
+          <w:p>
+            <w:r>
+              <w:rPr>
+                <w:b/>
+                <w:bCs/>
+              </w:rPr>
+              <w:t xml:space="preserve">Distribuição de probabilidades por estado (tempo acumulado / probabilidade):</w:t>
+            </w:r>
+          </w:p>
+          <w:p>
+            <w:r>
+              <w:t xml:space="preserve">Estado 0: 1.119,77  (1,1125%)</w:t>
+            </w:r>
+          </w:p>
+          <w:p>
+            <w:r>
+              <w:t xml:space="preserve">Estado 1: 49.594,92  (49,2743%)</w:t>
+            </w:r>
+          </w:p>
+          <w:p>
+            <w:r>
+              <w:t xml:space="preserve">Estado 2: 43.530,68  (43,2492%)</w:t>
+            </w:r>
+          </w:p>
+          <w:p>
+            <w:r>
+              <w:t xml:space="preserve">Estado 3: 6.405,40  (6,3640%)</w:t>
+            </w:r>
+          </w:p>
+          <w:p>
+            <w:r>
+              <w:rPr>
+                <w:b/>
+                <w:bCs/>
+              </w:rPr>
+              <w:t xml:space="preserve">Análise:</w:t>
+            </w:r>
+          </w:p>
+          <w:p>
+            <w:r>
+              <w:t xml:space="preserve">Com chegadas externas entre 1 e 5 (média 3) e atendimento entre 4 e 5 (média 4,5) em 2 servidores, a carga oferecida é ρ ≈ 3/(2×4,5) ≈ 0,33, ou seja, o sistema é estável. Ainda assim, como a capacidade é pequena (K = 3), a fila passa a maior parte do tempo com 1 ou 2 clientes (92,52%) e chega a ficar cheia em 6,36% do tempo, gerando 395 perdas por falta de vaga — essas perdas não chegam a alimentar a Fila 2.</w:t>
+            </w:r>
+          </w:p>
         </w:tc>
       </w:tr>
       <w:tr>
@@ -525,21 +438,7 @@
                 <w:b/>
                 <w:bCs/>
               </w:rPr>
-              <w:t xml:space="preserve"> </w:t>
-            </w:r>
-            <w:r>
-              <w:rPr>
-                <w:b/>
-                <w:bCs/>
-              </w:rPr>
-              <w:t>1</w:t>
-            </w:r>
-            <w:r>
-              <w:rPr>
-                <w:b/>
-                <w:bCs/>
-              </w:rPr>
-              <w:t>..3</w:t>
+              <w:t xml:space="preserve"> 1..3</w:t>
             </w:r>
             <w:r>
               <w:t>:</w:t>
@@ -554,12 +453,83 @@
             <w:tcW w:w="9629" w:type="dxa"/>
             <w:shd w:val="clear" w:color="auto" w:fill="FFFFFF" w:themeFill="background1"/>
           </w:tcPr>
-          <w:p/>
-          <w:p/>
-          <w:p/>
-          <w:p/>
-          <w:p/>
-          <w:p/>
+          <w:p>
+            <w:r>
+              <w:rPr>
+                <w:b/>
+                <w:bCs/>
+              </w:rPr>
+              <w:t xml:space="preserve">Resultados da simulação — Fila 2 (G/G/1/5), alimentada 100% pela saída da Fila 1</w:t>
+            </w:r>
+          </w:p>
+          <w:p>
+            <w:r>
+              <w:t xml:space="preserve">Números pseudoaleatórios utilizados na simulação da rede: 100.000 (mesma execução da Fila 1, ver acima)</w:t>
+            </w:r>
+          </w:p>
+          <w:p>
+            <w:r>
+              <w:t xml:space="preserve">Tempo global da simulação (rede completa): 100.650,77</w:t>
+            </w:r>
+          </w:p>
+          <w:p>
+            <w:r>
+              <w:t xml:space="preserve">Clientes perdidos (bloqueados) na Fila 2: 0</w:t>
+            </w:r>
+          </w:p>
+          <w:p>
+            <w:r>
+              <w:rPr>
+                <w:b/>
+                <w:bCs/>
+              </w:rPr>
+              <w:t xml:space="preserve">Distribuição de probabilidades por estado (tempo acumulado / probabilidade):</w:t>
+            </w:r>
+          </w:p>
+          <w:p>
+            <w:r>
+              <w:t xml:space="preserve">Estado 0: 33.990,49  (33,7707%)</w:t>
+            </w:r>
+          </w:p>
+          <w:p>
+            <w:r>
+              <w:t xml:space="preserve">Estado 1: 60.236,85  (59,8474%)</w:t>
+            </w:r>
+          </w:p>
+          <w:p>
+            <w:r>
+              <w:t xml:space="preserve">Estado 2: 6.413,65  (6,3722%)</w:t>
+            </w:r>
+          </w:p>
+          <w:p>
+            <w:r>
+              <w:t xml:space="preserve">Estado 3: 9,79  (0,0097%)</w:t>
+            </w:r>
+          </w:p>
+          <w:p>
+            <w:r>
+              <w:t xml:space="preserve">Estado 4: 0,00  (0,0000%)</w:t>
+            </w:r>
+          </w:p>
+          <w:p>
+            <w:r>
+              <w:t xml:space="preserve">Estado 5: 0,00  (0,0000%)</w:t>
+            </w:r>
+          </w:p>
+          <w:p>
+            <w:r>
+              <w:rPr>
+                <w:b/>
+                <w:bCs/>
+              </w:rPr>
+              <w:t xml:space="preserve">Análise:</w:t>
+            </w:r>
+          </w:p>
+          <w:p>
+            <w:r>
+              <w:t xml:space="preserve">A Fila 2 não tem chegada externa própria: seus clientes são exatamente os que saem atendidos da Fila 1. Com atendimento rápido (média 2, entre 1 e 3) e um único servidor, ela dá conta tranquilamente do fluxo recebido — fica vazia ou com 1 cliente em 93,62% do tempo, quase não acumula fila (6,37% com 2 clientes e apenas 0,01% com 3) e não perde nenhum cliente por falta de capacidade (K = 5).</w:t>
+            </w:r>
+          </w:p>
         </w:tc>
       </w:tr>
     </w:tbl>

</xml_diff>